<commit_message>
Q3 board pack final: ED edits applied; SDC shown as planned matched funding (CAP-521)
Co-Authored-By: Claude Opus 5.5 <noreply@anthropic.com>
Co-authored-by: multica-agent <github@multica.ai>
</commit_message>
<xml_diff>
--- a/2026/Q3/humanus_forecast-report_Oct26-Jun27.docx
+++ b/2026/Q3/humanus_forecast-report_Oct26-Jun27.docx
@@ -141,31 +141,6 @@
           <w:color w:val="410F37"/>
           <w:sz w:val="18"/>
         </w:rPr>
-        <w:t xml:space="preserve">Prepared by  </w:t>
-      </w:r>
-      <w:r>
-        <w:rPr>
-          <w:rFonts w:ascii="Fagun" w:hAnsi="Fagun" w:eastAsia="Fagun" w:cs="Fagun"/>
-          <w:b w:val="0"/>
-          <w:i w:val="0"/>
-          <w:color w:val="410F37"/>
-          <w:sz w:val="20"/>
-        </w:rPr>
-        <w:t>Stacy McGill, Finance Manager</w:t>
-      </w:r>
-    </w:p>
-    <w:p>
-      <w:pPr>
-        <w:spacing w:after="40"/>
-      </w:pPr>
-      <w:r>
-        <w:rPr>
-          <w:rFonts w:ascii="Fagun ExtraBold" w:hAnsi="Fagun ExtraBold" w:eastAsia="Fagun ExtraBold" w:cs="Fagun ExtraBold"/>
-          <w:b/>
-          <w:i w:val="0"/>
-          <w:color w:val="410F37"/>
-          <w:sz w:val="18"/>
-        </w:rPr>
         <w:t xml:space="preserve">Currency  </w:t>
       </w:r>
       <w:r>
@@ -236,7 +211,7 @@
           <w:color w:val="410F37"/>
           <w:sz w:val="20"/>
         </w:rPr>
-        <w:t>The 2026 deficit comes from income timing and SDC co-funding, not overspending.</w:t>
+        <w:t>The 2026 deficit comes from grant-claim timing and our planned co-funding of the SDC project, not overspending.</w:t>
       </w:r>
       <w:r>
         <w:rPr>
@@ -318,7 +293,7 @@
           <w:color w:val="410F37"/>
           <w:sz w:val="20"/>
         </w:rPr>
-        <w:t xml:space="preserve"> SDC co-funding USD 45,660; grant income earned in 2026 but claimable only in 2027, USD 33,614. These are partly offset by the core surplus.</w:t>
+        <w:t xml:space="preserve"> our planned matched share of the SDC project's final year, USD 45,660; grant income earned in 2026 but claimable only in 2027, USD 33,614. These are partly offset by the core surplus.</w:t>
       </w:r>
     </w:p>
     <w:p>
@@ -419,142 +394,6 @@
         <w:t xml:space="preserve"> Stimson paying the FCDO claim on receipt and Swiss tranche 2 in December, together with a freeze on discretionary spending.</w:t>
       </w:r>
     </w:p>
-    <w:tbl>
-      <w:tblPr>
-        <w:tblW w:type="auto" w:w="0"/>
-        <w:jc w:val="center"/>
-        <w:tblLook w:firstColumn="1" w:firstRow="1" w:lastColumn="0" w:lastRow="0" w:noHBand="0" w:noVBand="1" w:val="04A0"/>
-      </w:tblPr>
-      <w:tblGrid>
-        <w:gridCol w:w="9638"/>
-      </w:tblGrid>
-      <w:tr>
-        <w:tc>
-          <w:tcPr>
-            <w:tcW w:type="dxa" w:w="9638"/>
-            <w:shd w:val="clear" w:color="auto" w:fill="96FF14"/>
-          </w:tcPr>
-          <w:p>
-            <w:r/>
-            <w:r>
-              <w:rPr>
-                <w:rFonts w:ascii="Fagun ExtraBold" w:hAnsi="Fagun ExtraBold" w:eastAsia="Fagun ExtraBold" w:cs="Fagun ExtraBold"/>
-                <w:b/>
-                <w:i w:val="0"/>
-                <w:color w:val="410F37"/>
-                <w:sz w:val="22"/>
-              </w:rPr>
-              <w:t>Decisions needed (D2–D4 in the Board Finance Report)</w:t>
-            </w:r>
-          </w:p>
-          <w:p>
-            <w:pPr>
-              <w:spacing w:after="40"/>
-            </w:pPr>
-            <w:r>
-              <w:rPr>
-                <w:rFonts w:ascii="Fagun" w:hAnsi="Fagun" w:eastAsia="Fagun" w:cs="Fagun"/>
-                <w:b/>
-                <w:i w:val="0"/>
-                <w:color w:val="410F37"/>
-                <w:sz w:val="19"/>
-              </w:rPr>
-              <w:t>Freeze</w:t>
-            </w:r>
-            <w:r>
-              <w:rPr>
-                <w:rFonts w:ascii="Fagun" w:hAnsi="Fagun" w:eastAsia="Fagun" w:cs="Fagun"/>
-                <w:b w:val="0"/>
-                <w:i w:val="0"/>
-                <w:color w:val="410F37"/>
-                <w:sz w:val="19"/>
-              </w:rPr>
-              <w:t xml:space="preserve"> discretionary spending (travel, meetings, partner grants, new consultancy) until the OSF tranche is received. FCDO-reimbursable activity is exempt.</w:t>
-            </w:r>
-          </w:p>
-          <w:p>
-            <w:pPr>
-              <w:spacing w:after="40"/>
-            </w:pPr>
-            <w:r>
-              <w:rPr>
-                <w:rFonts w:ascii="Fagun" w:hAnsi="Fagun" w:eastAsia="Fagun" w:cs="Fagun"/>
-                <w:b/>
-                <w:i w:val="0"/>
-                <w:color w:val="410F37"/>
-                <w:sz w:val="19"/>
-              </w:rPr>
-              <w:t>Authorise the ED</w:t>
-            </w:r>
-            <w:r>
-              <w:rPr>
-                <w:rFonts w:ascii="Fagun" w:hAnsi="Fagun" w:eastAsia="Fagun" w:cs="Fagun"/>
-                <w:b w:val="0"/>
-                <w:i w:val="0"/>
-                <w:color w:val="410F37"/>
-                <w:sz w:val="19"/>
-              </w:rPr>
-              <w:t xml:space="preserve"> to ask OSF in writing to release the Year-3 tranche in early December 2026, and to ask Stimson to pay FCDO claim 1 on receipt and Swiss Myanmar tranche 2 in December.</w:t>
-            </w:r>
-          </w:p>
-          <w:p>
-            <w:pPr>
-              <w:spacing w:after="40"/>
-            </w:pPr>
-            <w:r>
-              <w:rPr>
-                <w:rFonts w:ascii="Fagun" w:hAnsi="Fagun" w:eastAsia="Fagun" w:cs="Fagun"/>
-                <w:b/>
-                <w:i w:val="0"/>
-                <w:color w:val="410F37"/>
-                <w:sz w:val="19"/>
-              </w:rPr>
-              <w:t>Agree a payment order for the 28 October run</w:t>
-            </w:r>
-            <w:r>
-              <w:rPr>
-                <w:rFonts w:ascii="Fagun" w:hAnsi="Fagun" w:eastAsia="Fagun" w:cs="Fagun"/>
-                <w:b w:val="0"/>
-                <w:i w:val="0"/>
-                <w:color w:val="410F37"/>
-                <w:sz w:val="19"/>
-              </w:rPr>
-              <w:t xml:space="preserve"> if the shortfall is not covered by then. Proposed: the Chair's stipend and other non-staff bills are deferred to November.</w:t>
-            </w:r>
-          </w:p>
-          <w:p>
-            <w:pPr>
-              <w:spacing w:after="40"/>
-            </w:pPr>
-            <w:r>
-              <w:rPr>
-                <w:rFonts w:ascii="Fagun" w:hAnsi="Fagun" w:eastAsia="Fagun" w:cs="Fagun"/>
-                <w:b/>
-                <w:i w:val="0"/>
-                <w:color w:val="410F37"/>
-                <w:sz w:val="19"/>
-              </w:rPr>
-              <w:t>Mandate the ED and Chair to arrange a standby bridge of up to USD 75,000</w:t>
-            </w:r>
-            <w:r>
-              <w:rPr>
-                <w:rFonts w:ascii="Fagun" w:hAnsi="Fagun" w:eastAsia="Fagun" w:cs="Fagun"/>
-                <w:b w:val="0"/>
-                <w:i w:val="0"/>
-                <w:color w:val="410F37"/>
-                <w:sz w:val="19"/>
-              </w:rPr>
-              <w:t xml:space="preserve"> (enough to cover the FCDO claim slipping to January). Use it only if neither OSF nor Stimson confirms by 20 November.</w:t>
-            </w:r>
-          </w:p>
-        </w:tc>
-      </w:tr>
-    </w:tbl>
-    <w:p>
-      <w:pPr>
-        <w:spacing w:after="80"/>
-      </w:pPr>
-    </w:p>
     <w:p>
       <w:pPr>
         <w:spacing w:before="200" w:after="80"/>
@@ -1624,7 +1463,7 @@
                 <w:color w:val="410F37"/>
                 <w:sz w:val="17"/>
               </w:rPr>
-              <w:t>SDC final-year co-funding (Art. 1.2 — FDFA covers max 50%)</w:t>
+              <w:t>Planned SDC co-funding, final year — hūmānus' matched share (Art. 1.2); grant balanced and audited</w:t>
             </w:r>
           </w:p>
         </w:tc>
@@ -1935,7 +1774,7 @@
           <w:color w:val="410F37"/>
           <w:sz w:val="20"/>
         </w:rPr>
-        <w:t>SDC co-funding is a one-off.</w:t>
+        <w:t>The SDC co-funding was planned and is now complete.</w:t>
       </w:r>
       <w:r>
         <w:rPr>
@@ -1945,7 +1784,7 @@
           <w:color w:val="410F37"/>
           <w:sz w:val="20"/>
         </w:rPr>
-        <w:t xml:space="preserve"> SDC closed on 30 April and is fully drawn, so this does not recur in 2027.</w:t>
+        <w:t xml:space="preserve"> The project closed on 30 April 2026, balanced over the life of the grant, and has been audited. FDFA paid its contribution in full, and nothing further falls in 2027.</w:t>
       </w:r>
     </w:p>
     <w:p>

</xml_diff>